<commit_message>
Add amplitude cross-correlation peak significance (Fig 2D)
Implement the manuscript shuffle test for block1–block2 OFC mid-gamma
xcorr peaks (Adhikari-style mean-subtracted xcorr over ±0.2 s; peak
significant if >95th percentile of 1000 permutation null peaks), plus a
driver that was missing from the repo (MAZE10_plotTFR_OFC_axis.m).

Co-authored-by: Maya Geva-Sagiv <mgevasagiv@users.noreply.github.com>
</commit_message>
<xml_diff>
--- a/README.docx
+++ b/README.docx
@@ -2470,6 +2470,22 @@
       </w:pPr>
     </w:p>
     <w:p/>
+    <w:p/>
+    <w:p>
+      <w:r>
+        <w:t>%% Block1-vs-Block2 OFC gamma amplitude cross-correlation peak significance (Figure 2D)</w:t>
+      </w:r>
+    </w:p>
+    <w:p>
+      <w:r>
+        <w:t>MAZE10_plotTFR_OFC_axis.m</w:t>
+      </w:r>
+    </w:p>
+    <w:p>
+      <w:r>
+        <w:t>% Mean-subtract envelopes, xcorr over lags +/- 0.2 s, then 1000 random permutations of one time course to build a null of peak values. Observed peak is significant if it exceeds the 95th percentile of the null (help_functions/amp_xcorr_peak_sig.m). Lag-0 corrcoef r/p is reported for description only.</w:t>
+      </w:r>
+    </w:p>
     <w:sectPr>
       <w:pgSz w:w="12240" w:h="15840"/>
       <w:pgMar w:top="1440" w:right="1440" w:bottom="1440" w:left="1440" w:header="720" w:footer="720" w:gutter="0"/>

</xml_diff>